<commit_message>
R2 revision: Arabic reports, tracking table, Ch3/Ch4 subscript fixes, rebuilt DOCX/PDF
- reports_ar/01-07: chapter-by-chapter changes, tracking table (md, xlsx),
  methodology-code-experiment mapping, verification log, supervisor
  decisions memo (no decision assumed), tests/reproduction and formatting
  review, remaining work
- Ch4: note on the estimator's layer (SC-6), frozen code unchanged
- Ch3/Ch4: raw underscore subscripts in prose converted for Word
- evidence: R2 relabelled copies of the quality appraisal and register
- rebuilt per-chapter and full DOCX and PDF

Co-Authored-By: Claude Opus 5.5 <noreply@anthropic.com>
Claude-Session: https://claude.ai/code/session_01LxTVpgiZk4YU8StvXUCTXS
</commit_message>
<xml_diff>
--- a/revision_R2/build/CHAPTER3_METHODOLOGY_R2.docx
+++ b/revision_R2/build/CHAPTER3_METHODOLOGY_R2.docx
@@ -7137,7 +7137,16 @@
         <w:t xml:space="preserve"> </w:t>
       </w:r>
       <w:r>
-        <w:t xml:space="preserve">Equation 3.4 fits the calibration map to the observed labels y_i. Platt’s original procedure instead fits against smoothed targets, t₊ = (N₊ + 1)/(N₊ + 2) and t₋ = 1/(N₋ + 2), to reduce overfitting on small calibration sets. This thesis takes Equation 3.4 as the reference definition and evaluates Platt’s smoothed targets as a sensitivity analysis.</w:t>
+        <w:t xml:space="preserve">Equation 3.4 fits the calibration map to the observed labels y</w:t>
+      </w:r>
+      <w:r>
+        <w:rPr>
+          <w:vertAlign w:val="subscript"/>
+        </w:rPr>
+        <w:t xml:space="preserve">i</w:t>
+      </w:r>
+      <w:r>
+        <w:t xml:space="preserve">. Platt’s original procedure instead fits against smoothed targets, t₊ = (N₊ + 1)/(N₊ + 2) and t₋ = 1/(N₋ + 2), to reduce overfitting on small calibration sets. This thesis takes Equation 3.4 as the reference definition and evaluates Platt’s smoothed targets as a sensitivity analysis.</w:t>
       </w:r>
     </w:p>
     <w:p>
@@ -8329,7 +8338,31 @@
         <w:t xml:space="preserve"> </w:t>
       </w:r>
       <w:r>
-        <w:t xml:space="preserve">s_t and p_t may still be computed and stored for audit, but they are marked as not used, and the audit record contains no risk table: the field is recorded as</w:t>
+        <w:t xml:space="preserve">s</w:t>
+      </w:r>
+      <w:r>
+        <w:rPr>
+          <w:vertAlign w:val="subscript"/>
+        </w:rPr>
+        <w:t xml:space="preserve">t</w:t>
+      </w:r>
+      <w:r>
+        <w:t xml:space="preserve"> </w:t>
+      </w:r>
+      <w:r>
+        <w:t xml:space="preserve">and p</w:t>
+      </w:r>
+      <w:r>
+        <w:rPr>
+          <w:vertAlign w:val="subscript"/>
+        </w:rPr>
+        <w:t xml:space="preserve">t</w:t>
+      </w:r>
+      <w:r>
+        <w:t xml:space="preserve"> </w:t>
+      </w:r>
+      <w:r>
+        <w:t xml:space="preserve">may still be computed and stored for audit, but they are marked as not used, and the audit record contains no risk table: the field is recorded as</w:t>
       </w:r>
       <w:r>
         <w:t xml:space="preserve"> </w:t>
@@ -12619,7 +12652,16 @@
         <w:t xml:space="preserve">REM without expected-loss Escalate</w:t>
       </w:r>
       <w:r>
-        <w:t xml:space="preserve">, in which Escalate is removed from the set 𝒱(a_t) used by Equation 3.7 but D2 is kept, gives REM exactly the baseline’s opportunity to escalate.</w:t>
+        <w:t xml:space="preserve">, in which Escalate is removed from the set 𝒱(a</w:t>
+      </w:r>
+      <w:r>
+        <w:rPr>
+          <w:vertAlign w:val="subscript"/>
+        </w:rPr>
+        <w:t xml:space="preserve">t</w:t>
+      </w:r>
+      <w:r>
+        <w:t xml:space="preserve">) used by Equation 3.7 but D2 is kept, gives REM exactly the baseline’s opportunity to escalate.</w:t>
       </w:r>
     </w:p>
     <w:p>
@@ -13767,7 +13809,19 @@
         <w:pStyle w:val="FirstParagraph"/>
       </w:pPr>
       <w:r>
-        <w:t xml:space="preserve">Line 8 computes the probability for every step so that the audit record is complete; when line 9 or line 10 applies, the record marks p_t as not used. Lines 16–20 implement both mitigation semantics of Table 3.14. Attribution (line 21) is computed after the verdict and cannot reach it.</w:t>
+        <w:t xml:space="preserve">Line 8 computes the probability for every step so that the audit record is complete; when line 9 or line 10 applies, the record marks p</w:t>
+      </w:r>
+      <w:r>
+        <w:rPr>
+          <w:vertAlign w:val="subscript"/>
+        </w:rPr>
+        <w:t xml:space="preserve">t</w:t>
+      </w:r>
+      <w:r>
+        <w:t xml:space="preserve"> </w:t>
+      </w:r>
+      <w:r>
+        <w:t xml:space="preserve">as not used. Lines 16–20 implement both mitigation semantics of Table 3.14. Attribution (line 21) is computed after the verdict and cannot reach it.</w:t>
       </w:r>
     </w:p>
     <w:bookmarkEnd w:id="61"/>
@@ -14554,7 +14608,16 @@
         <w:pStyle w:val="Compact"/>
       </w:pPr>
       <w:r>
-        <w:t xml:space="preserve">r_mod(k), estimated from episodes outside fold f;</w:t>
+        <w:t xml:space="preserve">r</w:t>
+      </w:r>
+      <w:r>
+        <w:rPr>
+          <w:vertAlign w:val="subscript"/>
+        </w:rPr>
+        <w:t xml:space="preserve">mod</w:t>
+      </w:r>
+      <w:r>
+        <w:t xml:space="preserve">(k), estimated from episodes outside fold f;</w:t>
       </w:r>
     </w:p>
     <w:p>
@@ -14969,7 +15032,16 @@
         <w:t xml:space="preserve">mod</w:t>
       </w:r>
       <w:r>
-        <w:t xml:space="preserve">(k) per tier and the utility impact of Modify on benign steps. These estimates feed Equation 3.5 and are fitted within the outer folds so that no held-out episode informs its own loss values. In this thesis, live enforcing-mode runs were not available. r_mod(k) was therefore estimated by replaying recorded attack episodes with Modify applied to every labelled attack step (Section 3.11.11). Under the no-adaptation assumption these estimates are close to zero by construction, and they are reported as such. The utility impact of Modify on benign steps was not estimated separately.</w:t>
+        <w:t xml:space="preserve">(k) per tier and the utility impact of Modify on benign steps. These estimates feed Equation 3.5 and are fitted within the outer folds so that no held-out episode informs its own loss values. In this thesis, live enforcing-mode runs were not available. r</w:t>
+      </w:r>
+      <w:r>
+        <w:rPr>
+          <w:vertAlign w:val="subscript"/>
+        </w:rPr>
+        <w:t xml:space="preserve">mod</w:t>
+      </w:r>
+      <w:r>
+        <w:t xml:space="preserve">(k) was therefore estimated by replaying recorded attack episodes with Modify applied to every labelled attack step (Section 3.11.11). Under the no-adaptation assumption these estimates are close to zero by construction, and they are reported as such. The utility impact of Modify on benign steps was not estimated separately.</w:t>
       </w:r>
     </w:p>
     <w:p>

</xml_diff>